<commit_message>
Businessplan: Anschrift, gesetzliche Vertreterin, doppelter Einstieg behoben
Co-Authored-By: Claude Opus 5.5 <noreply@anthropic.com>
Claude-Session: https://claude.ai/code/session_01CTYWb26xuS8aY8NDZ9pAbe
</commit_message>
<xml_diff>
--- a/businessplan/Businessplan Polina Jeske.docx
+++ b/businessplan/Businessplan Polina Jeske.docx
@@ -15,7 +15,7 @@
         <w:rPr>
           <w:color w:val="5A6275"/>
         </w:rPr>
-        <w:t>Polina Jeske · Ankum · Oktober 2026</w:t>
+        <w:t>Polina Jeske · Volllagerdamm 15A, 49577 Ankum · Oktober 2026</w:t>
       </w:r>
     </w:p>
     <w:p>
@@ -127,7 +127,7 @@
           <w:p>
             <w:r/>
             <w:r>
-              <w:t>[Straße und Hausnummer], [PLZ] Ankum</w:t>
+              <w:t>Volllagerdamm 15A, 49577 Ankum</w:t>
             </w:r>
           </w:p>
         </w:tc>
@@ -164,7 +164,7 @@
           <w:p>
             <w:r/>
             <w:r>
-              <w:t>Gesetzliche Vertreter</w:t>
+              <w:t>Gesetzliche Vertreterin</w:t>
             </w:r>
           </w:p>
         </w:tc>
@@ -175,7 +175,7 @@
           <w:p>
             <w:r/>
             <w:r>
-              <w:t>[Name der Mutter] und [Name des Vaters]</w:t>
+              <w:t>Katharina Jeske (Mutter)</w:t>
             </w:r>
           </w:p>
         </w:tc>
@@ -240,7 +240,7 @@
     </w:p>
     <w:p>
       <w:r>
-        <w:t>Ich bin Polina, 16 Jahre alt, und beschäftige mich seit einiger Zeit intensiv mit Webdesign. Daraus möchte ich jetzt ein kleines eigenes Gewerbe machen. Ich gestalte Websites für kleine Betriebe, Vereine und Selbstständige aus Ankum, Quakenbrück und Umgebung und kümmere mich auf Wunsch auch danach darum.</w:t>
+        <w:t>Neben der Schule möchte ich ein kleines Webdesign-Gewerbe führen. Ich gestalte Websites für kleine Betriebe, Vereine und Selbstständige aus Ankum, Quakenbrück und Umgebung und kümmere mich auf Wunsch auch danach darum.</w:t>
       </w:r>
     </w:p>
     <w:p>
@@ -1244,7 +1244,7 @@
         <w:pStyle w:val="ListBullet"/>
       </w:pPr>
       <w:r>
-        <w:t>Meine Eltern ermächtigen mich nach § 112 BGB, das Gewerbe selbständig zu betreiben. Dafür brauche ich die Genehmigung des Familiengerichts.</w:t>
+        <w:t>Meine Mutter ermächtigt mich als meine gesetzliche Vertreterin nach § 112 BGB, das Gewerbe selbständig zu betreiben. Dafür brauche ich die Genehmigung des Familiengerichts.</w:t>
       </w:r>
     </w:p>
     <w:p>
@@ -2486,7 +2486,7 @@
     </w:p>
     <w:p>
       <w:r>
-        <w:t>Ich bitte das Gericht deshalb, die Ermächtigung meiner Eltern zum selbständigen Betrieb meines Webdesign-Gewerbes nach § 112 BGB zu genehmigen.</w:t>
+        <w:t>Ich bitte das Gericht deshalb, die Ermächtigung durch meine Mutter zum selbständigen Betrieb meines Webdesign-Gewerbes nach § 112 BGB zu genehmigen.</w:t>
       </w:r>
     </w:p>
     <w:p>
@@ -2524,22 +2524,7 @@
     </w:p>
     <w:p>
       <w:r>
-        <w:t>[Name der Mutter], gesetzliche Vertreterin</w:t>
-      </w:r>
-    </w:p>
-    <w:p>
-      <w:pPr>
-        <w:spacing w:before="480"/>
-      </w:pPr>
-    </w:p>
-    <w:p>
-      <w:r>
-        <w:t>________________________________________</w:t>
-      </w:r>
-    </w:p>
-    <w:p>
-      <w:r>
-        <w:t>[Name des Vaters], gesetzlicher Vertreter</w:t>
+        <w:t>Katharina Jeske, gesetzliche Vertreterin</w:t>
       </w:r>
     </w:p>
     <w:sectPr>

</xml_diff>

<commit_message>
Businessplan: Absatz zu Umsatzgrenzen entfernt
Co-Authored-By: Claude Opus 5.5 <noreply@anthropic.com>
Claude-Session: https://claude.ai/code/session_01CTYWb26xuS8aY8NDZ9pAbe
</commit_message>
<xml_diff>
--- a/businessplan/Businessplan Polina Jeske.docx
+++ b/businessplan/Businessplan Polina Jeske.docx
@@ -2109,11 +2109,6 @@
     <w:p/>
     <w:p>
       <w:r>
-        <w:t>Damit bleibe ich weit unter der Grenze für Kleinunternehmer (25.000 € im Vorjahr, 100.000 € im laufenden Jahr). Auch Gewerbesteuer fällt bei diesem Gewinn nicht an, weil der Freibetrag bei 24.500 € liegt.</w:t>
-      </w:r>
-    </w:p>
-    <w:p>
-      <w:r>
         <w:t>Im schlimmsten Fall, also wenn ich gar keinen Kunden finde, verliere ich die etwa 30 € für die Anmeldung und ein paar Euro für das Hosting. Mehr Risiko gibt es für mich und meine Eltern nicht.</w:t>
       </w:r>
     </w:p>

</xml_diff>

<commit_message>
Businessplan: größere Schrift, Deckblatt eigene Seite, Seitenzahlen
Co-Authored-By: Claude Opus 5.5 <noreply@anthropic.com>
Claude-Session: https://claude.ai/code/session_01CTYWb26xuS8aY8NDZ9pAbe
</commit_message>
<xml_diff>
--- a/businessplan/Businessplan Polina Jeske.docx
+++ b/businessplan/Businessplan Polina Jeske.docx
@@ -21,6 +21,7 @@
     <w:p>
       <w:pPr>
         <w:pStyle w:val="Heading1"/>
+        <w:keepNext/>
       </w:pPr>
       <w:r>
         <w:t>Deckblatt</w:t>
@@ -37,11 +38,17 @@
         <w:gridCol w:w="4649"/>
       </w:tblGrid>
       <w:tr>
+        <w:trPr>
+          <w:cantSplit/>
+        </w:trPr>
         <w:tc>
           <w:tcPr>
             <w:tcW w:type="dxa" w:w="4649"/>
           </w:tcPr>
           <w:p>
+            <w:pPr>
+              <w:keepNext/>
+            </w:pPr>
             <w:r/>
             <w:r>
               <w:t>Vorhaben</w:t>
@@ -53,6 +60,9 @@
             <w:tcW w:type="dxa" w:w="4649"/>
           </w:tcPr>
           <w:p>
+            <w:pPr>
+              <w:keepNext/>
+            </w:pPr>
             <w:r/>
             <w:r>
               <w:t>Webdesign als Kleingewerbe (Erstellung und Betreuung von Websites)</w:t>
@@ -61,11 +71,17 @@
         </w:tc>
       </w:tr>
       <w:tr>
+        <w:trPr>
+          <w:cantSplit/>
+        </w:trPr>
         <w:tc>
           <w:tcPr>
             <w:tcW w:type="dxa" w:w="4649"/>
           </w:tcPr>
           <w:p>
+            <w:pPr>
+              <w:keepNext/>
+            </w:pPr>
             <w:r/>
             <w:r>
               <w:t>Name des Unternehmens</w:t>
@@ -77,6 +93,9 @@
             <w:tcW w:type="dxa" w:w="4649"/>
           </w:tcPr>
           <w:p>
+            <w:pPr>
+              <w:keepNext/>
+            </w:pPr>
             <w:r/>
             <w:r>
               <w:t>paluna.ai</w:t>
@@ -85,11 +104,17 @@
         </w:tc>
       </w:tr>
       <w:tr>
+        <w:trPr>
+          <w:cantSplit/>
+        </w:trPr>
         <w:tc>
           <w:tcPr>
             <w:tcW w:type="dxa" w:w="4649"/>
           </w:tcPr>
           <w:p>
+            <w:pPr>
+              <w:keepNext/>
+            </w:pPr>
             <w:r/>
             <w:r>
               <w:t>Gründerin</w:t>
@@ -101,6 +126,9 @@
             <w:tcW w:type="dxa" w:w="4649"/>
           </w:tcPr>
           <w:p>
+            <w:pPr>
+              <w:keepNext/>
+            </w:pPr>
             <w:r/>
             <w:r>
               <w:t>Polina Jeske, 16 Jahre</w:t>
@@ -109,11 +137,17 @@
         </w:tc>
       </w:tr>
       <w:tr>
+        <w:trPr>
+          <w:cantSplit/>
+        </w:trPr>
         <w:tc>
           <w:tcPr>
             <w:tcW w:type="dxa" w:w="4649"/>
           </w:tcPr>
           <w:p>
+            <w:pPr>
+              <w:keepNext/>
+            </w:pPr>
             <w:r/>
             <w:r>
               <w:t>Anschrift</w:t>
@@ -125,6 +159,9 @@
             <w:tcW w:type="dxa" w:w="4649"/>
           </w:tcPr>
           <w:p>
+            <w:pPr>
+              <w:keepNext/>
+            </w:pPr>
             <w:r/>
             <w:r>
               <w:t>Voltlager Damm 15A, 49577 Ankum</w:t>
@@ -133,11 +170,17 @@
         </w:tc>
       </w:tr>
       <w:tr>
+        <w:trPr>
+          <w:cantSplit/>
+        </w:trPr>
         <w:tc>
           <w:tcPr>
             <w:tcW w:type="dxa" w:w="4649"/>
           </w:tcPr>
           <w:p>
+            <w:pPr>
+              <w:keepNext/>
+            </w:pPr>
             <w:r/>
             <w:r>
               <w:t>Schule</w:t>
@@ -149,6 +192,9 @@
             <w:tcW w:type="dxa" w:w="4649"/>
           </w:tcPr>
           <w:p>
+            <w:pPr>
+              <w:keepNext/>
+            </w:pPr>
             <w:r/>
             <w:r>
               <w:t>Artland-Gymnasium Quakenbrück, 11. Klasse</w:t>
@@ -157,11 +203,17 @@
         </w:tc>
       </w:tr>
       <w:tr>
+        <w:trPr>
+          <w:cantSplit/>
+        </w:trPr>
         <w:tc>
           <w:tcPr>
             <w:tcW w:type="dxa" w:w="4649"/>
           </w:tcPr>
           <w:p>
+            <w:pPr>
+              <w:keepNext/>
+            </w:pPr>
             <w:r/>
             <w:r>
               <w:t>Gesetzliche Vertreterin</w:t>
@@ -173,6 +225,9 @@
             <w:tcW w:type="dxa" w:w="4649"/>
           </w:tcPr>
           <w:p>
+            <w:pPr>
+              <w:keepNext/>
+            </w:pPr>
             <w:r/>
             <w:r>
               <w:t>Katharina Jeske (Mutter)</w:t>
@@ -181,11 +236,17 @@
         </w:tc>
       </w:tr>
       <w:tr>
+        <w:trPr>
+          <w:cantSplit/>
+        </w:trPr>
         <w:tc>
           <w:tcPr>
             <w:tcW w:type="dxa" w:w="4649"/>
           </w:tcPr>
           <w:p>
+            <w:pPr>
+              <w:keepNext/>
+            </w:pPr>
             <w:r/>
             <w:r>
               <w:t>Anlass</w:t>
@@ -197,6 +258,9 @@
             <w:tcW w:type="dxa" w:w="4649"/>
           </w:tcPr>
           <w:p>
+            <w:pPr>
+              <w:keepNext/>
+            </w:pPr>
             <w:r/>
             <w:r>
               <w:t>Antrag auf Genehmigung der Ermächtigung zum selbständigen Betrieb eines Erwerbsgeschäfts nach § 112 BGB</w:t>
@@ -205,6 +269,9 @@
         </w:tc>
       </w:tr>
       <w:tr>
+        <w:trPr>
+          <w:cantSplit/>
+        </w:trPr>
         <w:tc>
           <w:tcPr>
             <w:tcW w:type="dxa" w:w="4649"/>
@@ -233,6 +300,8 @@
     <w:p>
       <w:pPr>
         <w:pStyle w:val="Heading1"/>
+        <w:keepNext/>
+        <w:pageBreakBefore/>
       </w:pPr>
       <w:r>
         <w:t>1. Zusammenfassung</w:t>
@@ -261,6 +330,7 @@
     <w:p>
       <w:pPr>
         <w:pStyle w:val="Heading1"/>
+        <w:keepNext/>
       </w:pPr>
       <w:r>
         <w:t>2. Über mich</w:t>
@@ -298,12 +368,18 @@
         <w:gridCol w:w="3099"/>
       </w:tblGrid>
       <w:tr>
+        <w:trPr>
+          <w:cantSplit/>
+        </w:trPr>
         <w:tc>
           <w:tcPr>
             <w:tcW w:type="dxa" w:w="3099"/>
             <w:shd w:val="clear" w:color="auto" w:fill="EEF0F4"/>
           </w:tcPr>
           <w:p>
+            <w:pPr>
+              <w:keepNext/>
+            </w:pPr>
             <w:r>
               <w:rPr>
                 <w:b/>
@@ -323,6 +399,9 @@
             <w:shd w:val="clear" w:color="auto" w:fill="EEF0F4"/>
           </w:tcPr>
           <w:p>
+            <w:pPr>
+              <w:keepNext/>
+            </w:pPr>
             <w:r>
               <w:rPr>
                 <w:b/>
@@ -342,6 +421,9 @@
             <w:shd w:val="clear" w:color="auto" w:fill="EEF0F4"/>
           </w:tcPr>
           <w:p>
+            <w:pPr>
+              <w:keepNext/>
+            </w:pPr>
             <w:r>
               <w:rPr>
                 <w:b/>
@@ -357,11 +439,17 @@
         </w:tc>
       </w:tr>
       <w:tr>
+        <w:trPr>
+          <w:cantSplit/>
+        </w:trPr>
         <w:tc>
           <w:tcPr>
             <w:tcW w:type="dxa" w:w="3099"/>
           </w:tcPr>
           <w:p>
+            <w:pPr>
+              <w:keepNext/>
+            </w:pPr>
             <w:r/>
             <w:r>
               <w:t>QUELL Massage</w:t>
@@ -373,6 +461,9 @@
             <w:tcW w:type="dxa" w:w="3099"/>
           </w:tcPr>
           <w:p>
+            <w:pPr>
+              <w:keepNext/>
+            </w:pPr>
             <w:r/>
             <w:r>
               <w:t>Massagestudio</w:t>
@@ -384,6 +475,9 @@
             <w:tcW w:type="dxa" w:w="3099"/>
           </w:tcPr>
           <w:p>
+            <w:pPr>
+              <w:keepNext/>
+            </w:pPr>
             <w:r/>
             <w:r>
               <w:t>Behandlungen mit Preisen, Terminbuchung, Kundenstimmen, 10 Sprachen, Impressum und Datenschutz</w:t>
@@ -392,11 +486,17 @@
         </w:tc>
       </w:tr>
       <w:tr>
+        <w:trPr>
+          <w:cantSplit/>
+        </w:trPr>
         <w:tc>
           <w:tcPr>
             <w:tcW w:type="dxa" w:w="3099"/>
           </w:tcPr>
           <w:p>
+            <w:pPr>
+              <w:keepNext/>
+            </w:pPr>
             <w:r/>
             <w:r>
               <w:t>Trucktrade</w:t>
@@ -408,6 +508,9 @@
             <w:tcW w:type="dxa" w:w="3099"/>
           </w:tcPr>
           <w:p>
+            <w:pPr>
+              <w:keepNext/>
+            </w:pPr>
             <w:r/>
             <w:r>
               <w:t>Händler für LKW-Ersatzteile</w:t>
@@ -419,6 +522,9 @@
             <w:tcW w:type="dxa" w:w="3099"/>
           </w:tcPr>
           <w:p>
+            <w:pPr>
+              <w:keepNext/>
+            </w:pPr>
             <w:r/>
             <w:r>
               <w:t>über 30 Unterseiten, Katalog mit Filter, Anfrageformulare, mehrsprachig</w:t>
@@ -427,11 +533,17 @@
         </w:tc>
       </w:tr>
       <w:tr>
+        <w:trPr>
+          <w:cantSplit/>
+        </w:trPr>
         <w:tc>
           <w:tcPr>
             <w:tcW w:type="dxa" w:w="3099"/>
           </w:tcPr>
           <w:p>
+            <w:pPr>
+              <w:keepNext/>
+            </w:pPr>
             <w:r/>
             <w:r>
               <w:t>Nagelstudio Daniela</w:t>
@@ -443,6 +555,9 @@
             <w:tcW w:type="dxa" w:w="3099"/>
           </w:tcPr>
           <w:p>
+            <w:pPr>
+              <w:keepNext/>
+            </w:pPr>
             <w:r/>
             <w:r>
               <w:t>Nagelstudio</w:t>
@@ -454,6 +569,9 @@
             <w:tcW w:type="dxa" w:w="3099"/>
           </w:tcPr>
           <w:p>
+            <w:pPr>
+              <w:keepNext/>
+            </w:pPr>
             <w:r/>
             <w:r>
               <w:t>Leistungen, Preisliste, Galerie, Kontaktformular, Cookie-Einstellungen, 3D-Effekte</w:t>
@@ -462,6 +580,9 @@
         </w:tc>
       </w:tr>
       <w:tr>
+        <w:trPr>
+          <w:cantSplit/>
+        </w:trPr>
         <w:tc>
           <w:tcPr>
             <w:tcW w:type="dxa" w:w="3099"/>
@@ -506,6 +627,7 @@
     <w:p>
       <w:pPr>
         <w:pStyle w:val="Heading1"/>
+        <w:keepNext/>
       </w:pPr>
       <w:r>
         <w:t>3. Geschäftsidee und Angebot</w:t>
@@ -665,6 +787,7 @@
     <w:p>
       <w:pPr>
         <w:pStyle w:val="Heading1"/>
+        <w:keepNext/>
       </w:pPr>
       <w:r>
         <w:t>4. Kunden und Wettbewerb</w:t>
@@ -737,12 +860,18 @@
         <w:gridCol w:w="3099"/>
       </w:tblGrid>
       <w:tr>
+        <w:trPr>
+          <w:cantSplit/>
+        </w:trPr>
         <w:tc>
           <w:tcPr>
             <w:tcW w:type="dxa" w:w="3099"/>
             <w:shd w:val="clear" w:color="auto" w:fill="EEF0F4"/>
           </w:tcPr>
           <w:p>
+            <w:pPr>
+              <w:keepNext/>
+            </w:pPr>
             <w:r>
               <w:rPr>
                 <w:b/>
@@ -762,6 +891,9 @@
             <w:shd w:val="clear" w:color="auto" w:fill="EEF0F4"/>
           </w:tcPr>
           <w:p>
+            <w:pPr>
+              <w:keepNext/>
+            </w:pPr>
             <w:r>
               <w:rPr>
                 <w:b/>
@@ -781,6 +913,9 @@
             <w:shd w:val="clear" w:color="auto" w:fill="EEF0F4"/>
           </w:tcPr>
           <w:p>
+            <w:pPr>
+              <w:keepNext/>
+            </w:pPr>
             <w:r>
               <w:rPr>
                 <w:b/>
@@ -796,11 +931,17 @@
         </w:tc>
       </w:tr>
       <w:tr>
+        <w:trPr>
+          <w:cantSplit/>
+        </w:trPr>
         <w:tc>
           <w:tcPr>
             <w:tcW w:type="dxa" w:w="3099"/>
           </w:tcPr>
           <w:p>
+            <w:pPr>
+              <w:keepNext/>
+            </w:pPr>
             <w:r/>
             <w:r>
               <w:t>Webdesign-Agenturen</w:t>
@@ -812,6 +953,9 @@
             <w:tcW w:type="dxa" w:w="3099"/>
           </w:tcPr>
           <w:p>
+            <w:pPr>
+              <w:keepNext/>
+            </w:pPr>
             <w:r/>
             <w:r>
               <w:t>viel Erfahrung, große Projekte</w:t>
@@ -823,6 +967,9 @@
             <w:tcW w:type="dxa" w:w="3099"/>
           </w:tcPr>
           <w:p>
+            <w:pPr>
+              <w:keepNext/>
+            </w:pPr>
             <w:r/>
             <w:r>
               <w:t>meistens deutlich teurer</w:t>
@@ -831,11 +978,17 @@
         </w:tc>
       </w:tr>
       <w:tr>
+        <w:trPr>
+          <w:cantSplit/>
+        </w:trPr>
         <w:tc>
           <w:tcPr>
             <w:tcW w:type="dxa" w:w="3099"/>
           </w:tcPr>
           <w:p>
+            <w:pPr>
+              <w:keepNext/>
+            </w:pPr>
             <w:r/>
             <w:r>
               <w:t>Baukasten-Systeme (z. B. Wix, Jimdo)</w:t>
@@ -847,6 +1000,9 @@
             <w:tcW w:type="dxa" w:w="3099"/>
           </w:tcPr>
           <w:p>
+            <w:pPr>
+              <w:keepNext/>
+            </w:pPr>
             <w:r/>
             <w:r>
               <w:t>günstig</w:t>
@@ -858,6 +1014,9 @@
             <w:tcW w:type="dxa" w:w="3099"/>
           </w:tcPr>
           <w:p>
+            <w:pPr>
+              <w:keepNext/>
+            </w:pPr>
             <w:r/>
             <w:r>
               <w:t>der Kunde muss alles selbst machen und braucht dafür Zeit</w:t>
@@ -866,11 +1025,17 @@
         </w:tc>
       </w:tr>
       <w:tr>
+        <w:trPr>
+          <w:cantSplit/>
+        </w:trPr>
         <w:tc>
           <w:tcPr>
             <w:tcW w:type="dxa" w:w="3099"/>
           </w:tcPr>
           <w:p>
+            <w:pPr>
+              <w:keepNext/>
+            </w:pPr>
             <w:r/>
             <w:r>
               <w:t>Freelancer aus dem Internet</w:t>
@@ -882,6 +1047,9 @@
             <w:tcW w:type="dxa" w:w="3099"/>
           </w:tcPr>
           <w:p>
+            <w:pPr>
+              <w:keepNext/>
+            </w:pPr>
             <w:r/>
             <w:r>
               <w:t>oft günstig</w:t>
@@ -893,6 +1061,9 @@
             <w:tcW w:type="dxa" w:w="3099"/>
           </w:tcPr>
           <w:p>
+            <w:pPr>
+              <w:keepNext/>
+            </w:pPr>
             <w:r/>
             <w:r>
               <w:t>kein persönlicher Kontakt, schwer erreichbar</w:t>
@@ -901,6 +1072,9 @@
         </w:tc>
       </w:tr>
       <w:tr>
+        <w:trPr>
+          <w:cantSplit/>
+        </w:trPr>
         <w:tc>
           <w:tcPr>
             <w:tcW w:type="dxa" w:w="3099"/>
@@ -948,6 +1122,7 @@
     <w:p>
       <w:pPr>
         <w:pStyle w:val="Heading1"/>
+        <w:keepNext/>
       </w:pPr>
       <w:r>
         <w:t>5. Preise und Kundengewinnung</w:t>
@@ -970,12 +1145,18 @@
         <w:gridCol w:w="3099"/>
       </w:tblGrid>
       <w:tr>
+        <w:trPr>
+          <w:cantSplit/>
+        </w:trPr>
         <w:tc>
           <w:tcPr>
             <w:tcW w:type="dxa" w:w="3099"/>
             <w:shd w:val="clear" w:color="auto" w:fill="EEF0F4"/>
           </w:tcPr>
           <w:p>
+            <w:pPr>
+              <w:keepNext/>
+            </w:pPr>
             <w:r>
               <w:rPr>
                 <w:b/>
@@ -995,6 +1176,9 @@
             <w:shd w:val="clear" w:color="auto" w:fill="EEF0F4"/>
           </w:tcPr>
           <w:p>
+            <w:pPr>
+              <w:keepNext/>
+            </w:pPr>
             <w:r>
               <w:rPr>
                 <w:b/>
@@ -1015,6 +1199,7 @@
           </w:tcPr>
           <w:p>
             <w:pPr>
+              <w:keepNext/>
               <w:jc w:val="right"/>
             </w:pPr>
             <w:r>
@@ -1032,11 +1217,17 @@
         </w:tc>
       </w:tr>
       <w:tr>
+        <w:trPr>
+          <w:cantSplit/>
+        </w:trPr>
         <w:tc>
           <w:tcPr>
             <w:tcW w:type="dxa" w:w="3099"/>
           </w:tcPr>
           <w:p>
+            <w:pPr>
+              <w:keepNext/>
+            </w:pPr>
             <w:r/>
             <w:r>
               <w:t>Starter</w:t>
@@ -1048,6 +1239,9 @@
             <w:tcW w:type="dxa" w:w="3099"/>
           </w:tcPr>
           <w:p>
+            <w:pPr>
+              <w:keepNext/>
+            </w:pPr>
             <w:r/>
             <w:r>
               <w:t>eine Seite (Onepager), Handy-Ansicht, Kontaktformular, Impressum und Datenschutz</w:t>
@@ -1060,6 +1254,7 @@
           </w:tcPr>
           <w:p>
             <w:pPr>
+              <w:keepNext/>
               <w:jc w:val="right"/>
             </w:pPr>
             <w:r/>
@@ -1070,11 +1265,17 @@
         </w:tc>
       </w:tr>
       <w:tr>
+        <w:trPr>
+          <w:cantSplit/>
+        </w:trPr>
         <w:tc>
           <w:tcPr>
             <w:tcW w:type="dxa" w:w="3099"/>
           </w:tcPr>
           <w:p>
+            <w:pPr>
+              <w:keepNext/>
+            </w:pPr>
             <w:r/>
             <w:r>
               <w:t>Business</w:t>
@@ -1086,6 +1287,9 @@
             <w:tcW w:type="dxa" w:w="3099"/>
           </w:tcPr>
           <w:p>
+            <w:pPr>
+              <w:keepNext/>
+            </w:pPr>
             <w:r/>
             <w:r>
               <w:t>bis zu 5 Unterseiten, eigenes Design, Karte und Social-Media-Links, Einweisung</w:t>
@@ -1098,6 +1302,7 @@
           </w:tcPr>
           <w:p>
             <w:pPr>
+              <w:keepNext/>
               <w:jc w:val="right"/>
             </w:pPr>
             <w:r/>
@@ -1108,6 +1313,9 @@
         </w:tc>
       </w:tr>
       <w:tr>
+        <w:trPr>
+          <w:cantSplit/>
+        </w:trPr>
         <w:tc>
           <w:tcPr>
             <w:tcW w:type="dxa" w:w="3099"/>
@@ -1221,6 +1429,7 @@
     <w:p>
       <w:pPr>
         <w:pStyle w:val="Heading1"/>
+        <w:keepNext/>
       </w:pPr>
       <w:r>
         <w:t>6. Rechtliches, Steuern und Organisation</w:t>
@@ -1234,6 +1443,7 @@
     <w:p>
       <w:pPr>
         <w:pStyle w:val="Heading2"/>
+        <w:keepNext/>
       </w:pPr>
       <w:r>
         <w:t>Anmeldung</w:t>
@@ -1266,6 +1476,7 @@
     <w:p>
       <w:pPr>
         <w:pStyle w:val="Heading2"/>
+        <w:keepNext/>
       </w:pPr>
       <w:r>
         <w:t>Steuern</w:t>
@@ -1306,6 +1517,7 @@
     <w:p>
       <w:pPr>
         <w:pStyle w:val="Heading2"/>
+        <w:keepNext/>
       </w:pPr>
       <w:r>
         <w:t>Verträge und Kundenseiten</w:t>
@@ -1346,6 +1558,7 @@
     <w:p>
       <w:pPr>
         <w:pStyle w:val="Heading2"/>
+        <w:keepNext/>
       </w:pPr>
       <w:r>
         <w:t>Geld</w:t>
@@ -1359,6 +1572,7 @@
     <w:p>
       <w:pPr>
         <w:pStyle w:val="Heading1"/>
+        <w:keepNext/>
       </w:pPr>
       <w:r>
         <w:t>7. Schule und Zeitplanung</w:t>
@@ -1385,12 +1599,18 @@
         <w:gridCol w:w="4649"/>
       </w:tblGrid>
       <w:tr>
+        <w:trPr>
+          <w:cantSplit/>
+        </w:trPr>
         <w:tc>
           <w:tcPr>
             <w:tcW w:type="dxa" w:w="4649"/>
             <w:shd w:val="clear" w:color="auto" w:fill="EEF0F4"/>
           </w:tcPr>
           <w:p>
+            <w:pPr>
+              <w:keepNext/>
+            </w:pPr>
             <w:r>
               <w:rPr>
                 <w:b/>
@@ -1410,6 +1630,9 @@
             <w:shd w:val="clear" w:color="auto" w:fill="EEF0F4"/>
           </w:tcPr>
           <w:p>
+            <w:pPr>
+              <w:keepNext/>
+            </w:pPr>
             <w:r>
               <w:rPr>
                 <w:b/>
@@ -1425,11 +1648,17 @@
         </w:tc>
       </w:tr>
       <w:tr>
+        <w:trPr>
+          <w:cantSplit/>
+        </w:trPr>
         <w:tc>
           <w:tcPr>
             <w:tcW w:type="dxa" w:w="4649"/>
           </w:tcPr>
           <w:p>
+            <w:pPr>
+              <w:keepNext/>
+            </w:pPr>
             <w:r/>
             <w:r>
               <w:t>Vormittags</w:t>
@@ -1441,6 +1670,9 @@
             <w:tcW w:type="dxa" w:w="4649"/>
           </w:tcPr>
           <w:p>
+            <w:pPr>
+              <w:keepNext/>
+            </w:pPr>
             <w:r/>
             <w:r>
               <w:t>Schule</w:t>
@@ -1449,11 +1681,17 @@
         </w:tc>
       </w:tr>
       <w:tr>
+        <w:trPr>
+          <w:cantSplit/>
+        </w:trPr>
         <w:tc>
           <w:tcPr>
             <w:tcW w:type="dxa" w:w="4649"/>
           </w:tcPr>
           <w:p>
+            <w:pPr>
+              <w:keepNext/>
+            </w:pPr>
             <w:r/>
             <w:r>
               <w:t>Früher Nachmittag</w:t>
@@ -1465,6 +1703,9 @@
             <w:tcW w:type="dxa" w:w="4649"/>
           </w:tcPr>
           <w:p>
+            <w:pPr>
+              <w:keepNext/>
+            </w:pPr>
             <w:r/>
             <w:r>
               <w:t>Hausaufgaben und Lernen</w:t>
@@ -1473,11 +1714,17 @@
         </w:tc>
       </w:tr>
       <w:tr>
+        <w:trPr>
+          <w:cantSplit/>
+        </w:trPr>
         <w:tc>
           <w:tcPr>
             <w:tcW w:type="dxa" w:w="4649"/>
           </w:tcPr>
           <w:p>
+            <w:pPr>
+              <w:keepNext/>
+            </w:pPr>
             <w:r/>
             <w:r>
               <w:t>Einzelne Nachmittage</w:t>
@@ -1489,6 +1736,9 @@
             <w:tcW w:type="dxa" w:w="4649"/>
           </w:tcPr>
           <w:p>
+            <w:pPr>
+              <w:keepNext/>
+            </w:pPr>
             <w:r/>
             <w:r>
               <w:t>Arbeit an Kundenprojekten, je etwa 1 bis 1,5 Stunden</w:t>
@@ -1497,11 +1747,17 @@
         </w:tc>
       </w:tr>
       <w:tr>
+        <w:trPr>
+          <w:cantSplit/>
+        </w:trPr>
         <w:tc>
           <w:tcPr>
             <w:tcW w:type="dxa" w:w="4649"/>
           </w:tcPr>
           <w:p>
+            <w:pPr>
+              <w:keepNext/>
+            </w:pPr>
             <w:r/>
             <w:r>
               <w:t>Wochenende</w:t>
@@ -1513,6 +1769,9 @@
             <w:tcW w:type="dxa" w:w="4649"/>
           </w:tcPr>
           <w:p>
+            <w:pPr>
+              <w:keepNext/>
+            </w:pPr>
             <w:r/>
             <w:r>
               <w:t>etwa 3 bis 4 Stunden, wenn nötig</w:t>
@@ -1521,6 +1780,9 @@
         </w:tc>
       </w:tr>
       <w:tr>
+        <w:trPr>
+          <w:cantSplit/>
+        </w:trPr>
         <w:tc>
           <w:tcPr>
             <w:tcW w:type="dxa" w:w="4649"/>
@@ -1599,6 +1861,7 @@
     <w:p>
       <w:pPr>
         <w:pStyle w:val="Heading1"/>
+        <w:keepNext/>
       </w:pPr>
       <w:r>
         <w:t>8. Finanzplanung</w:t>
@@ -1612,6 +1875,7 @@
     <w:p>
       <w:pPr>
         <w:pStyle w:val="Heading2"/>
+        <w:keepNext/>
       </w:pPr>
       <w:r>
         <w:t>Kosten</w:t>
@@ -1628,12 +1892,18 @@
         <w:gridCol w:w="4649"/>
       </w:tblGrid>
       <w:tr>
+        <w:trPr>
+          <w:cantSplit/>
+        </w:trPr>
         <w:tc>
           <w:tcPr>
             <w:tcW w:type="dxa" w:w="4649"/>
             <w:shd w:val="clear" w:color="auto" w:fill="EEF0F4"/>
           </w:tcPr>
           <w:p>
+            <w:pPr>
+              <w:keepNext/>
+            </w:pPr>
             <w:r>
               <w:rPr>
                 <w:b/>
@@ -1654,6 +1924,7 @@
           </w:tcPr>
           <w:p>
             <w:pPr>
+              <w:keepNext/>
               <w:jc w:val="right"/>
             </w:pPr>
             <w:r>
@@ -1671,11 +1942,17 @@
         </w:tc>
       </w:tr>
       <w:tr>
+        <w:trPr>
+          <w:cantSplit/>
+        </w:trPr>
         <w:tc>
           <w:tcPr>
             <w:tcW w:type="dxa" w:w="4649"/>
           </w:tcPr>
           <w:p>
+            <w:pPr>
+              <w:keepNext/>
+            </w:pPr>
             <w:r/>
             <w:r>
               <w:t>Gewerbeanmeldung (einmalig)</w:t>
@@ -1688,6 +1965,7 @@
           </w:tcPr>
           <w:p>
             <w:pPr>
+              <w:keepNext/>
               <w:jc w:val="right"/>
             </w:pPr>
             <w:r/>
@@ -1698,11 +1976,17 @@
         </w:tc>
       </w:tr>
       <w:tr>
+        <w:trPr>
+          <w:cantSplit/>
+        </w:trPr>
         <w:tc>
           <w:tcPr>
             <w:tcW w:type="dxa" w:w="4649"/>
           </w:tcPr>
           <w:p>
+            <w:pPr>
+              <w:keepNext/>
+            </w:pPr>
             <w:r/>
             <w:r>
               <w:t>Domain und Hosting für meine eigene Website</w:t>
@@ -1715,6 +1999,7 @@
           </w:tcPr>
           <w:p>
             <w:pPr>
+              <w:keepNext/>
               <w:jc w:val="right"/>
             </w:pPr>
             <w:r/>
@@ -1725,6 +2010,9 @@
         </w:tc>
       </w:tr>
       <w:tr>
+        <w:trPr>
+          <w:cantSplit/>
+        </w:trPr>
         <w:tc>
           <w:tcPr>
             <w:tcW w:type="dxa" w:w="4649"/>
@@ -1761,6 +2049,7 @@
     <w:p>
       <w:pPr>
         <w:pStyle w:val="Heading2"/>
+        <w:keepNext/>
       </w:pPr>
       <w:r>
         <w:t>Vorsichtige Planung für das erste Jahr</w:t>
@@ -1783,12 +2072,18 @@
         <w:gridCol w:w="3099"/>
       </w:tblGrid>
       <w:tr>
+        <w:trPr>
+          <w:cantSplit/>
+        </w:trPr>
         <w:tc>
           <w:tcPr>
             <w:tcW w:type="dxa" w:w="3099"/>
             <w:shd w:val="clear" w:color="auto" w:fill="EEF0F4"/>
           </w:tcPr>
           <w:p>
+            <w:pPr>
+              <w:keepNext/>
+            </w:pPr>
             <w:r>
               <w:rPr>
                 <w:b/>
@@ -1803,6 +2098,7 @@
           </w:tcPr>
           <w:p>
             <w:pPr>
+              <w:keepNext/>
               <w:jc w:val="right"/>
             </w:pPr>
             <w:r>
@@ -1825,6 +2121,7 @@
           </w:tcPr>
           <w:p>
             <w:pPr>
+              <w:keepNext/>
               <w:jc w:val="right"/>
             </w:pPr>
             <w:r>
@@ -1842,11 +2139,17 @@
         </w:tc>
       </w:tr>
       <w:tr>
+        <w:trPr>
+          <w:cantSplit/>
+        </w:trPr>
         <w:tc>
           <w:tcPr>
             <w:tcW w:type="dxa" w:w="3099"/>
           </w:tcPr>
           <w:p>
+            <w:pPr>
+              <w:keepNext/>
+            </w:pPr>
             <w:r/>
             <w:r>
               <w:t>Starter-Websites</w:t>
@@ -1859,6 +2162,7 @@
           </w:tcPr>
           <w:p>
             <w:pPr>
+              <w:keepNext/>
               <w:jc w:val="right"/>
             </w:pPr>
             <w:r/>
@@ -1873,6 +2177,7 @@
           </w:tcPr>
           <w:p>
             <w:pPr>
+              <w:keepNext/>
               <w:jc w:val="right"/>
             </w:pPr>
             <w:r/>
@@ -1883,11 +2188,17 @@
         </w:tc>
       </w:tr>
       <w:tr>
+        <w:trPr>
+          <w:cantSplit/>
+        </w:trPr>
         <w:tc>
           <w:tcPr>
             <w:tcW w:type="dxa" w:w="3099"/>
           </w:tcPr>
           <w:p>
+            <w:pPr>
+              <w:keepNext/>
+            </w:pPr>
             <w:r/>
             <w:r>
               <w:t>Business-Website</w:t>
@@ -1900,6 +2211,7 @@
           </w:tcPr>
           <w:p>
             <w:pPr>
+              <w:keepNext/>
               <w:jc w:val="right"/>
             </w:pPr>
             <w:r/>
@@ -1914,6 +2226,7 @@
           </w:tcPr>
           <w:p>
             <w:pPr>
+              <w:keepNext/>
               <w:jc w:val="right"/>
             </w:pPr>
             <w:r/>
@@ -1924,11 +2237,17 @@
         </w:tc>
       </w:tr>
       <w:tr>
+        <w:trPr>
+          <w:cantSplit/>
+        </w:trPr>
         <w:tc>
           <w:tcPr>
             <w:tcW w:type="dxa" w:w="3099"/>
           </w:tcPr>
           <w:p>
+            <w:pPr>
+              <w:keepNext/>
+            </w:pPr>
             <w:r/>
             <w:r>
               <w:t>Betreuung (2 Kunden für je 6 Monate)</w:t>
@@ -1941,6 +2260,7 @@
           </w:tcPr>
           <w:p>
             <w:pPr>
+              <w:keepNext/>
               <w:jc w:val="right"/>
             </w:pPr>
             <w:r/>
@@ -1955,6 +2275,7 @@
           </w:tcPr>
           <w:p>
             <w:pPr>
+              <w:keepNext/>
               <w:jc w:val="right"/>
             </w:pPr>
             <w:r/>
@@ -1965,11 +2286,17 @@
         </w:tc>
       </w:tr>
       <w:tr>
+        <w:trPr>
+          <w:cantSplit/>
+        </w:trPr>
         <w:tc>
           <w:tcPr>
             <w:tcW w:type="dxa" w:w="3099"/>
           </w:tcPr>
           <w:p>
+            <w:pPr>
+              <w:keepNext/>
+            </w:pPr>
             <w:r>
               <w:rPr>
                 <w:b/>
@@ -1988,6 +2315,9 @@
             <w:tcW w:type="dxa" w:w="3099"/>
           </w:tcPr>
           <w:p>
+            <w:pPr>
+              <w:keepNext/>
+            </w:pPr>
             <w:r>
               <w:rPr>
                 <w:b/>
@@ -2001,6 +2331,7 @@
           </w:tcPr>
           <w:p>
             <w:pPr>
+              <w:keepNext/>
               <w:jc w:val="right"/>
             </w:pPr>
             <w:r>
@@ -2018,11 +2349,17 @@
         </w:tc>
       </w:tr>
       <w:tr>
+        <w:trPr>
+          <w:cantSplit/>
+        </w:trPr>
         <w:tc>
           <w:tcPr>
             <w:tcW w:type="dxa" w:w="3099"/>
           </w:tcPr>
           <w:p>
+            <w:pPr>
+              <w:keepNext/>
+            </w:pPr>
             <w:r/>
             <w:r>
               <w:t>Kosten (Anmeldung, Domain, Hosting)</w:t>
@@ -2034,6 +2371,9 @@
             <w:tcW w:type="dxa" w:w="3099"/>
           </w:tcPr>
           <w:p>
+            <w:pPr>
+              <w:keepNext/>
+            </w:pPr>
             <w:r/>
           </w:p>
         </w:tc>
@@ -2043,6 +2383,7 @@
           </w:tcPr>
           <w:p>
             <w:pPr>
+              <w:keepNext/>
               <w:jc w:val="right"/>
             </w:pPr>
             <w:r/>
@@ -2053,6 +2394,9 @@
         </w:tc>
       </w:tr>
       <w:tr>
+        <w:trPr>
+          <w:cantSplit/>
+        </w:trPr>
         <w:tc>
           <w:tcPr>
             <w:tcW w:type="dxa" w:w="3099"/>
@@ -2115,6 +2459,7 @@
     <w:p>
       <w:pPr>
         <w:pStyle w:val="Heading1"/>
+        <w:keepNext/>
       </w:pPr>
       <w:r>
         <w:t>9. Chancen und Risiken</w:t>
@@ -2123,6 +2468,7 @@
     <w:p>
       <w:pPr>
         <w:pStyle w:val="Heading2"/>
+        <w:keepNext/>
       </w:pPr>
       <w:r>
         <w:t>Chancen</w:t>
@@ -2163,6 +2509,7 @@
     <w:p>
       <w:pPr>
         <w:pStyle w:val="Heading2"/>
+        <w:keepNext/>
       </w:pPr>
       <w:r>
         <w:t>Risiken und was ich dagegen tue</w:t>
@@ -2179,12 +2526,18 @@
         <w:gridCol w:w="4649"/>
       </w:tblGrid>
       <w:tr>
+        <w:trPr>
+          <w:cantSplit/>
+        </w:trPr>
         <w:tc>
           <w:tcPr>
             <w:tcW w:type="dxa" w:w="4649"/>
             <w:shd w:val="clear" w:color="auto" w:fill="EEF0F4"/>
           </w:tcPr>
           <w:p>
+            <w:pPr>
+              <w:keepNext/>
+            </w:pPr>
             <w:r>
               <w:rPr>
                 <w:b/>
@@ -2204,6 +2557,9 @@
             <w:shd w:val="clear" w:color="auto" w:fill="EEF0F4"/>
           </w:tcPr>
           <w:p>
+            <w:pPr>
+              <w:keepNext/>
+            </w:pPr>
             <w:r>
               <w:rPr>
                 <w:b/>
@@ -2219,11 +2575,17 @@
         </w:tc>
       </w:tr>
       <w:tr>
+        <w:trPr>
+          <w:cantSplit/>
+        </w:trPr>
         <w:tc>
           <w:tcPr>
             <w:tcW w:type="dxa" w:w="4649"/>
           </w:tcPr>
           <w:p>
+            <w:pPr>
+              <w:keepNext/>
+            </w:pPr>
             <w:r/>
             <w:r>
               <w:t>Die Schule leidet</w:t>
@@ -2235,6 +2597,9 @@
             <w:tcW w:type="dxa" w:w="4649"/>
           </w:tcPr>
           <w:p>
+            <w:pPr>
+              <w:keepNext/>
+            </w:pPr>
             <w:r/>
             <w:r>
               <w:t>feste Obergrenze von 8 Stunden pro Woche, keine neuen Aufträge vor Prüfungen, bei schlechteren Noten sofort zurückfahren</w:t>
@@ -2243,11 +2608,17 @@
         </w:tc>
       </w:tr>
       <w:tr>
+        <w:trPr>
+          <w:cantSplit/>
+        </w:trPr>
         <w:tc>
           <w:tcPr>
             <w:tcW w:type="dxa" w:w="4649"/>
           </w:tcPr>
           <w:p>
+            <w:pPr>
+              <w:keepNext/>
+            </w:pPr>
             <w:r/>
             <w:r>
               <w:t>Ein Kunde zahlt nicht</w:t>
@@ -2259,6 +2630,9 @@
             <w:tcW w:type="dxa" w:w="4649"/>
           </w:tcPr>
           <w:p>
+            <w:pPr>
+              <w:keepNext/>
+            </w:pPr>
             <w:r/>
             <w:r>
               <w:t>schriftliches Angebot vorher, bei größeren Aufträgen eine Anzahlung, Erinnerung und Mahnung mit Hilfe meiner Eltern</w:t>
@@ -2267,11 +2641,17 @@
         </w:tc>
       </w:tr>
       <w:tr>
+        <w:trPr>
+          <w:cantSplit/>
+        </w:trPr>
         <w:tc>
           <w:tcPr>
             <w:tcW w:type="dxa" w:w="4649"/>
           </w:tcPr>
           <w:p>
+            <w:pPr>
+              <w:keepNext/>
+            </w:pPr>
             <w:r/>
             <w:r>
               <w:t>Fehler bei Steuern oder Rechnungen</w:t>
@@ -2283,6 +2663,9 @@
             <w:tcW w:type="dxa" w:w="4649"/>
           </w:tcPr>
           <w:p>
+            <w:pPr>
+              <w:keepNext/>
+            </w:pPr>
             <w:r/>
             <w:r>
               <w:t>meine Mutter prüft als Steuerfachangestellte alle Unterlagen</w:t>
@@ -2291,11 +2674,17 @@
         </w:tc>
       </w:tr>
       <w:tr>
+        <w:trPr>
+          <w:cantSplit/>
+        </w:trPr>
         <w:tc>
           <w:tcPr>
             <w:tcW w:type="dxa" w:w="4649"/>
           </w:tcPr>
           <w:p>
+            <w:pPr>
+              <w:keepNext/>
+            </w:pPr>
             <w:r/>
             <w:r>
               <w:t>Ich übernehme mich mit einem Projekt</w:t>
@@ -2307,6 +2696,9 @@
             <w:tcW w:type="dxa" w:w="4649"/>
           </w:tcPr>
           <w:p>
+            <w:pPr>
+              <w:keepNext/>
+            </w:pPr>
             <w:r/>
             <w:r>
               <w:t>am Anfang nur kleinere Aufträge, größere bespreche ich vorher mit meinen Eltern</w:t>
@@ -2315,11 +2707,17 @@
         </w:tc>
       </w:tr>
       <w:tr>
+        <w:trPr>
+          <w:cantSplit/>
+        </w:trPr>
         <w:tc>
           <w:tcPr>
             <w:tcW w:type="dxa" w:w="4649"/>
           </w:tcPr>
           <w:p>
+            <w:pPr>
+              <w:keepNext/>
+            </w:pPr>
             <w:r/>
             <w:r>
               <w:t>Probleme mit Bildrechten oder Datenschutz</w:t>
@@ -2331,6 +2729,9 @@
             <w:tcW w:type="dxa" w:w="4649"/>
           </w:tcPr>
           <w:p>
+            <w:pPr>
+              <w:keepNext/>
+            </w:pPr>
             <w:r/>
             <w:r>
               <w:t>nur lizenzfreie Bilder, Impressum und Datenschutzerklärung auf jeder Seite</w:t>
@@ -2339,6 +2740,9 @@
         </w:tc>
       </w:tr>
       <w:tr>
+        <w:trPr>
+          <w:cantSplit/>
+        </w:trPr>
         <w:tc>
           <w:tcPr>
             <w:tcW w:type="dxa" w:w="4649"/>
@@ -2367,6 +2771,7 @@
     <w:p>
       <w:pPr>
         <w:pStyle w:val="Heading1"/>
+        <w:keepNext/>
       </w:pPr>
       <w:r>
         <w:t>10. Ziele</w:t>
@@ -2469,6 +2874,8 @@
     <w:p>
       <w:pPr>
         <w:pStyle w:val="Heading1"/>
+        <w:keepNext/>
+        <w:pageBreakBefore/>
       </w:pPr>
       <w:r>
         <w:t>11. Schlusswort</w:t>
@@ -2523,6 +2930,7 @@
       </w:r>
     </w:p>
     <w:sectPr>
+      <w:footerReference w:type="default" r:id="rId9"/>
       <w:pgSz w:w="11906" w:h="16838"/>
       <w:pgMar w:top="1134" w:right="1304" w:bottom="1134" w:left="1304" w:header="720" w:footer="720" w:gutter="0"/>
       <w:cols w:space="720"/>
@@ -2530,6 +2938,77 @@
     </w:sectPr>
   </w:body>
 </w:document>
+</file>
+
+<file path=word/footer1.xml><?xml version="1.0" encoding="utf-8"?>
+<w:ftr xmlns:m="http://schemas.openxmlformats.org/officeDocument/2006/math" xmlns:mc="http://schemas.openxmlformats.org/markup-compatibility/2006" xmlns:mo="http://schemas.microsoft.com/office/mac/office/2008/main" xmlns:mv="urn:schemas-microsoft-com:mac:vml" xmlns:o="urn:schemas-microsoft-com:office:office" xmlns:r="http://schemas.openxmlformats.org/officeDocument/2006/relationships" xmlns:v="urn:schemas-microsoft-com:vml" xmlns:w10="urn:schemas-microsoft-com:office:word" xmlns:w14="http://schemas.microsoft.com/office/word/2010/wordml" xmlns:w="http://schemas.openxmlformats.org/wordprocessingml/2006/main" xmlns:wne="http://schemas.microsoft.com/office/word/2006/wordml" xmlns:wp14="http://schemas.microsoft.com/office/word/2010/wordprocessingDrawing" xmlns:wp="http://schemas.openxmlformats.org/drawingml/2006/wordprocessingDrawing" xmlns:wpc="http://schemas.microsoft.com/office/word/2010/wordprocessingCanvas" xmlns:wpg="http://schemas.microsoft.com/office/word/2010/wordprocessingGroup" xmlns:wpi="http://schemas.microsoft.com/office/word/2010/wordprocessingInk" xmlns:wps="http://schemas.microsoft.com/office/word/2010/wordprocessingShape" mc:Ignorable="w14 wp14">
+  <w:p>
+    <w:pPr>
+      <w:pStyle w:val="Footer"/>
+      <w:jc w:val="center"/>
+    </w:pPr>
+    <w:r>
+      <w:rPr>
+        <w:sz w:val="20"/>
+      </w:rPr>
+      <w:t xml:space="preserve">Seite </w:t>
+    </w:r>
+    <w:r>
+      <w:rPr>
+        <w:sz w:val="20"/>
+      </w:rPr>
+      <w:fldChar w:fldCharType="begin"/>
+    </w:r>
+    <w:r>
+      <w:rPr>
+        <w:sz w:val="20"/>
+      </w:rPr>
+      <w:instrText xml:space="preserve">PAGE</w:instrText>
+    </w:r>
+    <w:r>
+      <w:rPr>
+        <w:sz w:val="20"/>
+      </w:rPr>
+      <w:fldChar w:fldCharType="separate"/>
+    </w:r>
+    <w:r>
+      <w:rPr>
+        <w:sz w:val="20"/>
+      </w:rPr>
+      <w:fldChar w:fldCharType="end"/>
+    </w:r>
+    <w:r>
+      <w:rPr>
+        <w:sz w:val="20"/>
+      </w:rPr>
+      <w:t xml:space="preserve"> von </w:t>
+    </w:r>
+    <w:r>
+      <w:rPr>
+        <w:sz w:val="20"/>
+      </w:rPr>
+      <w:fldChar w:fldCharType="begin"/>
+    </w:r>
+    <w:r>
+      <w:rPr>
+        <w:sz w:val="20"/>
+      </w:rPr>
+      <w:instrText xml:space="preserve">NUMPAGES</w:instrText>
+    </w:r>
+    <w:r>
+      <w:rPr>
+        <w:sz w:val="20"/>
+      </w:rPr>
+      <w:fldChar w:fldCharType="separate"/>
+    </w:r>
+    <w:r>
+      <w:rPr>
+        <w:sz w:val="20"/>
+      </w:rPr>
+      <w:fldChar w:fldCharType="end"/>
+    </w:r>
+  </w:p>
+</w:ftr>
 </file>
 
 <file path=word/numbering.xml><?xml version="1.0" encoding="utf-8"?>
@@ -2900,7 +3379,7 @@
     </w:pPr>
     <w:rPr>
       <w:rFonts w:ascii="Calibri" w:hAnsi="Calibri"/>
-      <w:sz w:val="22"/>
+      <w:sz w:val="24"/>
     </w:rPr>
   </w:style>
   <w:style w:type="paragraph" w:styleId="Header">
@@ -2966,7 +3445,7 @@
       <w:b/>
       <w:bCs/>
       <w:color w:val="1D2230"/>
-      <w:sz w:val="30"/>
+      <w:sz w:val="34"/>
       <w:szCs w:val="28"/>
     </w:rPr>
   </w:style>
@@ -2990,7 +3469,7 @@
       <w:b/>
       <w:bCs/>
       <w:color w:val="1D2230"/>
-      <w:sz w:val="23"/>
+      <w:sz w:val="26"/>
       <w:szCs w:val="26"/>
     </w:rPr>
   </w:style>
@@ -3255,7 +3734,7 @@
       <w:color w:val="1D2230"/>
       <w:spacing w:val="5"/>
       <w:kern w:val="28"/>
-      <w:sz w:val="44"/>
+      <w:sz w:val="52"/>
       <w:szCs w:val="52"/>
     </w:rPr>
   </w:style>

</xml_diff>